<commit_message>
feat: expand research profile and funded projects
</commit_message>
<xml_diff>
--- a/assets/Linsen_Wang_CV.docx
+++ b/assets/Linsen_Wang_CV.docx
@@ -207,7 +207,7 @@
             </w:hyperlink>
             <w:r>
               <w:rPr>
-                <w:rFonts w:ascii="Times New Roman" w:hAnsi="Times New Roman" w:cs="Times New Roman"/>
+                <w:rFonts w:ascii="Times New Roman" w:hAnsi="Times New Roman" w:cs="Times New Roman" w:hint="eastAsia"/>
               </w:rPr>
               <w:t xml:space="preserve"> </w:t>
             </w:r>
@@ -215,7 +215,7 @@
               <w:rPr>
                 <w:rFonts w:ascii="Times New Roman" w:hAnsi="Times New Roman" w:cs="Times New Roman" w:hint="eastAsia"/>
               </w:rPr>
-              <w:t xml:space="preserve">                                   </w:t>
+              <w:t xml:space="preserve">                                  </w:t>
             </w:r>
             <w:r>
               <w:rPr>
@@ -242,9 +242,106 @@
           <w:p>
             <w:pPr>
               <w:rPr>
+                <w:rFonts w:ascii="Times New Roman" w:hAnsi="Times New Roman" w:cs="Times New Roman" w:hint="eastAsia"/>
+              </w:rPr>
+            </w:pPr>
+            <w:r>
+              <w:rPr>
+                <w:rFonts w:ascii="Times New Roman" w:hAnsi="Times New Roman" w:cs="Times New Roman" w:hint="eastAsia"/>
+              </w:rPr>
+              <w:t>Personal Website:</w:t>
+            </w:r>
+            <w:r>
+              <w:t xml:space="preserve"> </w:t>
+            </w:r>
+            <w:r>
+              <w:rPr>
+                <w:rFonts w:ascii="Times New Roman" w:hAnsi="Times New Roman" w:cs="Times New Roman"/>
+              </w:rPr>
+              <w:t>https://geo-ai-for-health.github.io/index.html</w:t>
+            </w:r>
+          </w:p>
+          <w:p>
+            <w:pPr>
+              <w:rPr>
                 <w:rFonts w:ascii="Times New Roman" w:hAnsi="Times New Roman" w:cs="Times New Roman"/>
               </w:rPr>
             </w:pPr>
+            <w:r>
+              <w:rPr>
+                <w:rFonts w:ascii="Times New Roman" w:hAnsi="Times New Roman" w:cs="Times New Roman"/>
+                <w:noProof/>
+                <w:sz w:val="24"/>
+                <w:szCs w:val="24"/>
+              </w:rPr>
+              <mc:AlternateContent>
+                <mc:Choice Requires="wps">
+                  <w:drawing>
+                    <wp:anchor distT="0" distB="0" distL="114300" distR="114300" simplePos="0" relativeHeight="251673600" behindDoc="0" locked="0" layoutInCell="1" allowOverlap="1" wp14:anchorId="5CB2F776" wp14:editId="14CD18C2">
+                      <wp:simplePos x="0" y="0"/>
+                      <wp:positionH relativeFrom="margin">
+                        <wp:posOffset>-84170</wp:posOffset>
+                      </wp:positionH>
+                      <wp:positionV relativeFrom="page">
+                        <wp:posOffset>785101</wp:posOffset>
+                      </wp:positionV>
+                      <wp:extent cx="6224270" cy="0"/>
+                      <wp:effectExtent l="0" t="0" r="0" b="0"/>
+                      <wp:wrapNone/>
+                      <wp:docPr id="916715583" name="直接连接符 2"/>
+                      <wp:cNvGraphicFramePr/>
+                      <a:graphic xmlns:a="http://schemas.openxmlformats.org/drawingml/2006/main">
+                        <a:graphicData uri="http://schemas.microsoft.com/office/word/2010/wordprocessingShape">
+                          <wps:wsp>
+                            <wps:cNvCnPr/>
+                            <wps:spPr>
+                              <a:xfrm>
+                                <a:off x="0" y="0"/>
+                                <a:ext cx="6224270" cy="0"/>
+                              </a:xfrm>
+                              <a:prstGeom prst="line">
+                                <a:avLst/>
+                              </a:prstGeom>
+                              <a:ln w="12700">
+                                <a:solidFill>
+                                  <a:schemeClr val="tx1"/>
+                                </a:solidFill>
+                              </a:ln>
+                            </wps:spPr>
+                            <wps:style>
+                              <a:lnRef idx="1">
+                                <a:schemeClr val="accent1"/>
+                              </a:lnRef>
+                              <a:fillRef idx="0">
+                                <a:schemeClr val="accent1"/>
+                              </a:fillRef>
+                              <a:effectRef idx="0">
+                                <a:schemeClr val="accent1"/>
+                              </a:effectRef>
+                              <a:fontRef idx="minor">
+                                <a:schemeClr val="tx1"/>
+                              </a:fontRef>
+                            </wps:style>
+                            <wps:bodyPr/>
+                          </wps:wsp>
+                        </a:graphicData>
+                      </a:graphic>
+                      <wp14:sizeRelH relativeFrom="margin">
+                        <wp14:pctWidth>0</wp14:pctWidth>
+                      </wp14:sizeRelH>
+                    </wp:anchor>
+                  </w:drawing>
+                </mc:Choice>
+                <mc:Fallback>
+                  <w:pict>
+                    <v:line w14:anchorId="54ABFF20" id="直接连接符 2" o:spid="_x0000_s1026" style="position:absolute;z-index:251673600;visibility:visible;mso-wrap-style:square;mso-width-percent:0;mso-wrap-distance-left:9pt;mso-wrap-distance-top:0;mso-wrap-distance-right:9pt;mso-wrap-distance-bottom:0;mso-position-horizontal:absolute;mso-position-horizontal-relative:margin;mso-position-vertical:absolute;mso-position-vertical-relative:page;mso-width-percent:0;mso-width-relative:margin" from="-6.65pt,61.8pt" to="483.45pt,61.8pt" o:gfxdata="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" strokecolor="black [3213]" strokeweight="1pt">
+                      <v:stroke joinstyle="miter"/>
+                      <w10:wrap anchorx="margin" anchory="page"/>
+                    </v:line>
+                  </w:pict>
+                </mc:Fallback>
+              </mc:AlternateContent>
+            </w:r>
             <w:r>
               <w:rPr>
                 <w:rFonts w:ascii="Times New Roman" w:hAnsi="Times New Roman" w:cs="Times New Roman" w:hint="eastAsia"/>
@@ -287,81 +384,6 @@
           <w:szCs w:val="24"/>
         </w:rPr>
       </w:pPr>
-      <w:r>
-        <w:rPr>
-          <w:rFonts w:ascii="Times New Roman" w:hAnsi="Times New Roman" w:cs="Times New Roman"/>
-          <w:noProof/>
-          <w:sz w:val="24"/>
-          <w:szCs w:val="24"/>
-        </w:rPr>
-        <mc:AlternateContent>
-          <mc:Choice Requires="wps">
-            <w:drawing>
-              <wp:anchor distT="0" distB="0" distL="114300" distR="114300" simplePos="0" relativeHeight="251673600" behindDoc="0" locked="0" layoutInCell="1" allowOverlap="1" wp14:anchorId="5CB2F776" wp14:editId="7416FD11">
-                <wp:simplePos x="0" y="0"/>
-                <wp:positionH relativeFrom="margin">
-                  <wp:posOffset>-85725</wp:posOffset>
-                </wp:positionH>
-                <wp:positionV relativeFrom="page">
-                  <wp:posOffset>1945640</wp:posOffset>
-                </wp:positionV>
-                <wp:extent cx="6224270" cy="0"/>
-                <wp:effectExtent l="0" t="0" r="0" b="0"/>
-                <wp:wrapNone/>
-                <wp:docPr id="916715583" name="直接连接符 2"/>
-                <wp:cNvGraphicFramePr/>
-                <a:graphic xmlns:a="http://schemas.openxmlformats.org/drawingml/2006/main">
-                  <a:graphicData uri="http://schemas.microsoft.com/office/word/2010/wordprocessingShape">
-                    <wps:wsp>
-                      <wps:cNvCnPr/>
-                      <wps:spPr>
-                        <a:xfrm>
-                          <a:off x="0" y="0"/>
-                          <a:ext cx="6224270" cy="0"/>
-                        </a:xfrm>
-                        <a:prstGeom prst="line">
-                          <a:avLst/>
-                        </a:prstGeom>
-                        <a:ln w="12700">
-                          <a:solidFill>
-                            <a:schemeClr val="tx1"/>
-                          </a:solidFill>
-                        </a:ln>
-                      </wps:spPr>
-                      <wps:style>
-                        <a:lnRef idx="1">
-                          <a:schemeClr val="accent1"/>
-                        </a:lnRef>
-                        <a:fillRef idx="0">
-                          <a:schemeClr val="accent1"/>
-                        </a:fillRef>
-                        <a:effectRef idx="0">
-                          <a:schemeClr val="accent1"/>
-                        </a:effectRef>
-                        <a:fontRef idx="minor">
-                          <a:schemeClr val="tx1"/>
-                        </a:fontRef>
-                      </wps:style>
-                      <wps:bodyPr/>
-                    </wps:wsp>
-                  </a:graphicData>
-                </a:graphic>
-                <wp14:sizeRelH relativeFrom="margin">
-                  <wp14:pctWidth>0</wp14:pctWidth>
-                </wp14:sizeRelH>
-              </wp:anchor>
-            </w:drawing>
-          </mc:Choice>
-          <mc:Fallback>
-            <w:pict>
-              <v:line w14:anchorId="3F6BD0E7" id="直接连接符 2" o:spid="_x0000_s1026" style="position:absolute;left:0;text-align:left;z-index:251673600;visibility:visible;mso-wrap-style:square;mso-width-percent:0;mso-wrap-distance-left:9pt;mso-wrap-distance-top:0;mso-wrap-distance-right:9pt;mso-wrap-distance-bottom:0;mso-position-horizontal:absolute;mso-position-horizontal-relative:margin;mso-position-vertical:absolute;mso-position-vertical-relative:page;mso-width-percent:0;mso-width-relative:margin" from="-6.75pt,153.2pt" to="483.35pt,153.2pt" o:gfxdata="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" strokecolor="black [3213]" strokeweight="1pt">
-                <v:stroke joinstyle="miter"/>
-                <w10:wrap anchorx="margin" anchory="page"/>
-              </v:line>
-            </w:pict>
-          </mc:Fallback>
-        </mc:AlternateContent>
-      </w:r>
       <w:r>
         <w:rPr>
           <w:rFonts w:ascii="Times New Roman" w:hAnsi="Times New Roman" w:cs="Times New Roman"/>
@@ -2544,6 +2566,7 @@
           <w:rFonts w:ascii="Times New Roman" w:hAnsi="Times New Roman" w:cs="Times New Roman"/>
           <w:szCs w:val="21"/>
         </w:rPr>
+        <w:lastRenderedPageBreak/>
         <w:t>[</w:t>
       </w:r>
       <w:r>
@@ -2585,15 +2608,7 @@
           <w:rFonts w:ascii="Times New Roman" w:hAnsi="Times New Roman" w:cs="Times New Roman"/>
           <w:szCs w:val="21"/>
         </w:rPr>
-        <w:t xml:space="preserve">, Kwan, M. P., Zhou, S., &amp; Liu, D. (2024). Assessing the affective quality of soundscape for individuals: </w:t>
-      </w:r>
-      <w:r>
-        <w:rPr>
-          <w:rFonts w:ascii="Times New Roman" w:hAnsi="Times New Roman" w:cs="Times New Roman"/>
-          <w:szCs w:val="21"/>
-        </w:rPr>
-        <w:lastRenderedPageBreak/>
-        <w:t xml:space="preserve">Using third-party assessment combined with an artificial intelligence (TPA-AI) model. </w:t>
+        <w:t xml:space="preserve">, Kwan, M. P., Zhou, S., &amp; Liu, D. (2024). Assessing the affective quality of soundscape for individuals: Using third-party assessment combined with an artificial intelligence (TPA-AI) model. </w:t>
       </w:r>
       <w:r>
         <w:rPr>
@@ -4907,7 +4922,15 @@
           <w:rFonts w:ascii="Times New Roman" w:hAnsi="Times New Roman" w:cs="Times New Roman"/>
           <w:szCs w:val="21"/>
         </w:rPr>
-        <w:t xml:space="preserve"> Key Technologies for Intelligent Spatial Development Management and Planning Support of Villages and Towns at the County Level, 2020</w:t>
+        <w:t xml:space="preserve"> Key Technologies for Intelligent Spatial Development Management and Planning Support of Villages </w:t>
+      </w:r>
+      <w:r>
+        <w:rPr>
+          <w:rFonts w:ascii="Times New Roman" w:hAnsi="Times New Roman" w:cs="Times New Roman"/>
+          <w:szCs w:val="21"/>
+        </w:rPr>
+        <w:lastRenderedPageBreak/>
+        <w:t>and Towns at the County Level, 2020</w:t>
       </w:r>
       <w:r>
         <w:rPr>
@@ -4944,7 +4967,6 @@
           <w:bCs/>
           <w:szCs w:val="21"/>
         </w:rPr>
-        <w:lastRenderedPageBreak/>
         <w:t>National Key R&amp;D Program Sub</w:t>
       </w:r>
       <w:r>
@@ -5273,8 +5295,9 @@
           <w:iCs/>
           <w:szCs w:val="21"/>
         </w:rPr>
-        <w:t>Huma</w:t>
-      </w:r>
+        <w:t xml:space="preserve">Journal of </w:t>
+      </w:r>
+      <w:proofErr w:type="spellStart"/>
       <w:r>
         <w:rPr>
           <w:rFonts w:ascii="Times New Roman" w:hAnsi="Times New Roman" w:cs="Times New Roman"/>
@@ -5282,6 +5305,66 @@
           <w:iCs/>
           <w:szCs w:val="21"/>
         </w:rPr>
+        <w:t>Geovisualization</w:t>
+      </w:r>
+      <w:proofErr w:type="spellEnd"/>
+      <w:r>
+        <w:rPr>
+          <w:rFonts w:ascii="Times New Roman" w:hAnsi="Times New Roman" w:cs="Times New Roman"/>
+          <w:i/>
+          <w:iCs/>
+          <w:szCs w:val="21"/>
+        </w:rPr>
+        <w:t xml:space="preserve"> and Spatial Analysis</w:t>
+      </w:r>
+      <w:r>
+        <w:rPr>
+          <w:rFonts w:ascii="Times New Roman" w:hAnsi="Times New Roman" w:cs="Times New Roman" w:hint="eastAsia"/>
+          <w:i/>
+          <w:iCs/>
+          <w:szCs w:val="21"/>
+        </w:rPr>
+        <w:t xml:space="preserve">, </w:t>
+      </w:r>
+      <w:r>
+        <w:rPr>
+          <w:rFonts w:ascii="Times New Roman" w:hAnsi="Times New Roman" w:cs="Times New Roman" w:hint="eastAsia"/>
+          <w:i/>
+          <w:iCs/>
+          <w:szCs w:val="21"/>
+        </w:rPr>
+        <w:t>Applied Geography</w:t>
+      </w:r>
+      <w:r>
+        <w:rPr>
+          <w:rFonts w:ascii="Times New Roman" w:hAnsi="Times New Roman" w:cs="Times New Roman" w:hint="eastAsia"/>
+          <w:szCs w:val="21"/>
+        </w:rPr>
+        <w:t>,</w:t>
+      </w:r>
+      <w:r>
+        <w:rPr>
+          <w:rFonts w:ascii="Times New Roman" w:hAnsi="Times New Roman" w:cs="Times New Roman" w:hint="eastAsia"/>
+          <w:szCs w:val="21"/>
+        </w:rPr>
+        <w:t xml:space="preserve"> </w:t>
+      </w:r>
+      <w:r>
+        <w:rPr>
+          <w:rFonts w:ascii="Times New Roman" w:hAnsi="Times New Roman" w:cs="Times New Roman"/>
+          <w:i/>
+          <w:iCs/>
+          <w:szCs w:val="21"/>
+        </w:rPr>
+        <w:t>Huma</w:t>
+      </w:r>
+      <w:r>
+        <w:rPr>
+          <w:rFonts w:ascii="Times New Roman" w:hAnsi="Times New Roman" w:cs="Times New Roman"/>
+          <w:i/>
+          <w:iCs/>
+          <w:szCs w:val="21"/>
+        </w:rPr>
         <w:t>nities and Social Sciences Communications, Advances in Continuous and Discrete Models, Journal of Environmental Management, BMC Public Health</w:t>
       </w:r>
       <w:r>
@@ -5290,6 +5373,31 @@
           <w:szCs w:val="21"/>
         </w:rPr>
         <w:t xml:space="preserve">, </w:t>
+      </w:r>
+      <w:r>
+        <w:rPr>
+          <w:rFonts w:ascii="Times New Roman" w:hAnsi="Times New Roman" w:cs="Times New Roman"/>
+          <w:i/>
+          <w:iCs/>
+          <w:szCs w:val="21"/>
+        </w:rPr>
+        <w:t>Applied Spatial Analysis and Policy</w:t>
+      </w:r>
+      <w:r>
+        <w:rPr>
+          <w:rFonts w:ascii="Times New Roman" w:hAnsi="Times New Roman" w:cs="Times New Roman" w:hint="eastAsia"/>
+          <w:i/>
+          <w:iCs/>
+          <w:szCs w:val="21"/>
+        </w:rPr>
+        <w:t>,</w:t>
+      </w:r>
+      <w:r>
+        <w:rPr>
+          <w:rFonts w:ascii="Times New Roman" w:hAnsi="Times New Roman" w:cs="Times New Roman" w:hint="eastAsia"/>
+          <w:szCs w:val="21"/>
+        </w:rPr>
+        <w:t xml:space="preserve"> </w:t>
       </w:r>
       <w:r>
         <w:rPr>

</xml_diff>